<commit_message>
docs: fokus pembangunan mobile, ML dan pemrosesan gambar dijeda
</commit_message>
<xml_diff>
--- a/Pembagian Tugas/pembagian-tugas-minggu-5.docx
+++ b/Pembagian Tugas/pembagian-tugas-minggu-5.docx
@@ -2,7 +2,7 @@
 <file path=word/document.xml><?xml version="1.0" encoding="utf-8"?>
 <w:document xmlns:w="http://schemas.openxmlformats.org/wordprocessingml/2006/main" xmlns:m="http://schemas.openxmlformats.org/officeDocument/2006/math" xmlns:r="http://schemas.openxmlformats.org/officeDocument/2006/relationships" xmlns:o="urn:schemas-microsoft-com:office:office" xmlns:v="urn:schemas-microsoft-com:vml" xmlns:w10="urn:schemas-microsoft-com:office:word" xmlns:a="http://schemas.openxmlformats.org/drawingml/2006/main" xmlns:pic="http://schemas.openxmlformats.org/drawingml/2006/picture" xmlns:wp="http://schemas.openxmlformats.org/drawingml/2006/wordprocessingDrawing">
   <w:body>
-    <w:bookmarkStart w:id="31" w:name="daftar-kerja-minggu-5--sera-z"/>
+    <w:bookmarkStart w:id="32" w:name="daftar-kerja-minggu-5--sera-z"/>
     <w:p>
       <w:pPr>
         <w:pStyle w:val="Heading1"/>
@@ -38,12 +38,6 @@
         <w:t xml:space="preserve"> </w:t>
       </w:r>
       <w:r>
-        <w:t xml:space="preserve">(sisa minggu 5)</w:t>
-      </w:r>
-      <w:r>
-        <w:t xml:space="preserve"> </w:t>
-      </w:r>
-      <w:r>
         <w:t xml:space="preserve">Disusun: 27 Oktober 2026</w:t>
       </w:r>
     </w:p>
@@ -52,7 +46,7 @@
         <w:pStyle w:val="BodyText"/>
       </w:pPr>
       <w:r>
-        <w:t xml:space="preserve">Prinsip minggu ini:</w:t>
+        <w:t xml:space="preserve">Fokus:</w:t>
       </w:r>
       <w:r>
         <w:t xml:space="preserve"> </w:t>
@@ -62,22 +56,32 @@
           <w:bCs/>
           <w:b/>
         </w:rPr>
-        <w:t xml:space="preserve">mobile dulu, ML menyusul</w:t>
-      </w:r>
-      <w:r>
-        <w:t xml:space="preserve">.</w:t>
+        <w:t xml:space="preserve">pembangunan mobile saja</w:t>
+      </w:r>
+      <w:r>
+        <w:t xml:space="preserve">. ML dan pemrosesan gambar belum dikerjakan.</w:t>
+      </w:r>
+    </w:p>
+    <w:p>
+      <w:pPr>
+        <w:pStyle w:val="BodyText"/>
+      </w:pPr>
+      <w:r>
+        <w:t xml:space="preserve">Dikerjakan: E2 penyimpanan, E3 autentikasi, E8.1, E8.2, E8.4, E8.6, E8.7.</w:t>
       </w:r>
       <w:r>
         <w:t xml:space="preserve"> </w:t>
       </w:r>
       <w:r>
-        <w:t xml:space="preserve">Perubahan 27 Oktober: penyimpanan (E2) pindah dari Abim ke Faatihurrizki Prasojo</w:t>
-      </w:r>
-      <w:r>
-        <w:t xml:space="preserve"> </w:t>
-      </w:r>
-      <w:r>
-        <w:t xml:space="preserve">(Pras); modul warna (E5) dan foto lapangan (E10.2) pindah ke Abim.</w:t>
+        <w:t xml:space="preserve">Dijeda: E4, E5, E6, E7, E8.3, E8.5, E9, E10.</w:t>
+      </w:r>
+    </w:p>
+    <w:p>
+      <w:pPr>
+        <w:pStyle w:val="BodyText"/>
+      </w:pPr>
+      <w:r>
+        <w:t xml:space="preserve">Total 20,5 ho, rata-rata 4,1 ho per orang.</w:t>
       </w:r>
     </w:p>
     <w:p>
@@ -87,13 +91,13 @@
         </w:pict>
       </w:r>
     </w:p>
-    <w:bookmarkStart w:id="20" w:name="X2043125ae7644f1eceafbf527f2c7dca9ff8205"/>
+    <w:bookmarkStart w:id="20" w:name="Xaabf453faf34d6721be8ab385c12ed3223779ab"/>
     <w:p>
       <w:pPr>
         <w:pStyle w:val="Heading2"/>
       </w:pPr>
       <w:r>
-        <w:t xml:space="preserve">1. Prioritas</w:t>
+        <w:t xml:space="preserve">1. Ringkasan tugas</w:t>
       </w:r>
     </w:p>
     <w:tbl>
@@ -111,7 +115,7 @@
               <w:jc w:val="left"/>
             </w:pPr>
             <w:r>
-              <w:t xml:space="preserve">Prioritas</w:t>
+              <w:t xml:space="preserve">Anggota</w:t>
             </w:r>
           </w:p>
         </w:tc>
@@ -130,48 +134,15 @@
           <w:p>
             <w:pPr>
               <w:pStyle w:val="Compact"/>
-              <w:jc w:val="left"/>
-            </w:pPr>
-            <w:r>
-              <w:t xml:space="preserve">Pemilik</w:t>
-            </w:r>
-          </w:p>
-        </w:tc>
-        <w:tc>
-          <w:p>
-            <w:pPr>
-              <w:pStyle w:val="Compact"/>
-              <w:jc w:val="left"/>
-            </w:pPr>
-            <w:r>
-              <w:t xml:space="preserve">Alasan</w:t>
-            </w:r>
-          </w:p>
-        </w:tc>
-      </w:tr>
-      <w:tr>
-        <w:tc>
-          <w:p>
-            <w:pPr>
-              <w:pStyle w:val="Compact"/>
-              <w:jc w:val="left"/>
-            </w:pPr>
-            <w:r>
-              <w:t xml:space="preserve">P0</w:t>
-            </w:r>
-          </w:p>
-        </w:tc>
-        <w:tc>
-          <w:p>
-            <w:pPr>
-              <w:pStyle w:val="Compact"/>
-              <w:jc w:val="left"/>
-            </w:pPr>
-            <w:r>
-              <w:t xml:space="preserve">E2.1, E2.2</w:t>
-            </w:r>
-          </w:p>
-        </w:tc>
+              <w:jc w:val="right"/>
+            </w:pPr>
+            <w:r>
+              <w:t xml:space="preserve">ho</w:t>
+            </w:r>
+          </w:p>
+        </w:tc>
+      </w:tr>
+      <w:tr>
         <w:tc>
           <w:p>
             <w:pPr>
@@ -190,34 +161,58 @@
               <w:jc w:val="left"/>
             </w:pPr>
             <w:r>
-              <w:t xml:space="preserve">Membuka E8.6, E8.1, E8.2, E8.4</w:t>
-            </w:r>
-          </w:p>
-        </w:tc>
-      </w:tr>
-      <w:tr>
-        <w:tc>
-          <w:p>
-            <w:pPr>
-              <w:pStyle w:val="Compact"/>
-              <w:jc w:val="left"/>
-            </w:pPr>
-            <w:r>
-              <w:t xml:space="preserve">P0</w:t>
-            </w:r>
-          </w:p>
-        </w:tc>
-        <w:tc>
-          <w:p>
-            <w:pPr>
-              <w:pStyle w:val="Compact"/>
-              <w:jc w:val="left"/>
-            </w:pPr>
-            <w:r>
-              <w:t xml:space="preserve">E3.1</w:t>
-            </w:r>
-          </w:p>
-        </w:tc>
+              <w:t xml:space="preserve">E2.1 setup DB, E2.2 CRUD lemari, E2.3 simpan foto</w:t>
+            </w:r>
+          </w:p>
+        </w:tc>
+        <w:tc>
+          <w:p>
+            <w:pPr>
+              <w:pStyle w:val="Compact"/>
+              <w:jc w:val="right"/>
+            </w:pPr>
+            <w:r>
+              <w:t xml:space="preserve">3,5</w:t>
+            </w:r>
+          </w:p>
+        </w:tc>
+      </w:tr>
+      <w:tr>
+        <w:tc>
+          <w:p>
+            <w:pPr>
+              <w:pStyle w:val="Compact"/>
+              <w:jc w:val="left"/>
+            </w:pPr>
+            <w:r>
+              <w:t xml:space="preserve">Ahmad</w:t>
+            </w:r>
+          </w:p>
+        </w:tc>
+        <w:tc>
+          <w:p>
+            <w:pPr>
+              <w:pStyle w:val="Compact"/>
+              <w:jc w:val="left"/>
+            </w:pPr>
+            <w:r>
+              <w:t xml:space="preserve">E2.4 tabel outfit + riwayat, E2.5 muat saat start, E2.6 test DAO</w:t>
+            </w:r>
+          </w:p>
+        </w:tc>
+        <w:tc>
+          <w:p>
+            <w:pPr>
+              <w:pStyle w:val="Compact"/>
+              <w:jc w:val="right"/>
+            </w:pPr>
+            <w:r>
+              <w:t xml:space="preserve">3,5</w:t>
+            </w:r>
+          </w:p>
+        </w:tc>
+      </w:tr>
+      <w:tr>
         <w:tc>
           <w:p>
             <w:pPr>
@@ -236,34 +231,58 @@
               <w:jc w:val="left"/>
             </w:pPr>
             <w:r>
-              <w:t xml:space="preserve">Membuka E3.2–E3.4 dan E8.7</w:t>
-            </w:r>
-          </w:p>
-        </w:tc>
-      </w:tr>
-      <w:tr>
-        <w:tc>
-          <w:p>
-            <w:pPr>
-              <w:pStyle w:val="Compact"/>
-              <w:jc w:val="left"/>
-            </w:pPr>
-            <w:r>
-              <w:t xml:space="preserve">P0</w:t>
-            </w:r>
-          </w:p>
-        </w:tc>
-        <w:tc>
-          <w:p>
-            <w:pPr>
-              <w:pStyle w:val="Compact"/>
-              <w:jc w:val="left"/>
-            </w:pPr>
-            <w:r>
-              <w:t xml:space="preserve">E5.1</w:t>
-            </w:r>
-          </w:p>
-        </w:tc>
+              <w:t xml:space="preserve">E3.1 login Google, E3.2 record cloud, E3.3 sesi, E3.4 sign out</w:t>
+            </w:r>
+          </w:p>
+        </w:tc>
+        <w:tc>
+          <w:p>
+            <w:pPr>
+              <w:pStyle w:val="Compact"/>
+              <w:jc w:val="right"/>
+            </w:pPr>
+            <w:r>
+              <w:t xml:space="preserve">5,0</w:t>
+            </w:r>
+          </w:p>
+        </w:tc>
+      </w:tr>
+      <w:tr>
+        <w:tc>
+          <w:p>
+            <w:pPr>
+              <w:pStyle w:val="Compact"/>
+              <w:jc w:val="left"/>
+            </w:pPr>
+            <w:r>
+              <w:t xml:space="preserve">Izza</w:t>
+            </w:r>
+          </w:p>
+        </w:tc>
+        <w:tc>
+          <w:p>
+            <w:pPr>
+              <w:pStyle w:val="Compact"/>
+              <w:jc w:val="left"/>
+            </w:pPr>
+            <w:r>
+              <w:t xml:space="preserve">E8.6 halaman Admin, E8.1 CRUD UI Lemari</w:t>
+            </w:r>
+          </w:p>
+        </w:tc>
+        <w:tc>
+          <w:p>
+            <w:pPr>
+              <w:pStyle w:val="Compact"/>
+              <w:jc w:val="right"/>
+            </w:pPr>
+            <w:r>
+              <w:t xml:space="preserve">4,0</w:t>
+            </w:r>
+          </w:p>
+        </w:tc>
+      </w:tr>
+      <w:tr>
         <w:tc>
           <w:p>
             <w:pPr>
@@ -282,244 +301,18 @@
               <w:jc w:val="left"/>
             </w:pPr>
             <w:r>
-              <w:t xml:space="preserve">Tanpa prasyarat, tidak butuh dataset</w:t>
-            </w:r>
-          </w:p>
-        </w:tc>
-      </w:tr>
-      <w:tr>
-        <w:tc>
-          <w:p>
-            <w:pPr>
-              <w:pStyle w:val="Compact"/>
-              <w:jc w:val="left"/>
-            </w:pPr>
-            <w:r>
-              <w:t xml:space="preserve">P0</w:t>
-            </w:r>
-          </w:p>
-        </w:tc>
-        <w:tc>
-          <w:p>
-            <w:pPr>
-              <w:pStyle w:val="Compact"/>
-              <w:jc w:val="left"/>
-            </w:pPr>
-            <w:r>
-              <w:t xml:space="preserve">E9.1</w:t>
-            </w:r>
-          </w:p>
-        </w:tc>
-        <w:tc>
-          <w:p>
-            <w:pPr>
-              <w:pStyle w:val="Compact"/>
-              <w:jc w:val="left"/>
-            </w:pPr>
-            <w:r>
-              <w:t xml:space="preserve">Ahmad</w:t>
-            </w:r>
-          </w:p>
-        </w:tc>
-        <w:tc>
-          <w:p>
-            <w:pPr>
-              <w:pStyle w:val="Compact"/>
-              <w:jc w:val="left"/>
-            </w:pPr>
-            <w:r>
-              <w:t xml:space="preserve">Harus siap sebelum E9.2; bisa jalan tanpa kode</w:t>
-            </w:r>
-          </w:p>
-        </w:tc>
-      </w:tr>
-      <w:tr>
-        <w:tc>
-          <w:p>
-            <w:pPr>
-              <w:pStyle w:val="Compact"/>
-              <w:jc w:val="left"/>
-            </w:pPr>
-            <w:r>
-              <w:t xml:space="preserve">P0</w:t>
-            </w:r>
-          </w:p>
-        </w:tc>
-        <w:tc>
-          <w:p>
-            <w:pPr>
-              <w:pStyle w:val="Compact"/>
-              <w:jc w:val="left"/>
-            </w:pPr>
-            <w:r>
-              <w:t xml:space="preserve">Review dan gabung PR #3</w:t>
-            </w:r>
-          </w:p>
-        </w:tc>
-        <w:tc>
-          <w:p>
-            <w:pPr>
-              <w:pStyle w:val="Compact"/>
-              <w:jc w:val="left"/>
-            </w:pPr>
-            <w:r>
-              <w:t xml:space="preserve">Ahmad, Bisma</w:t>
-            </w:r>
-          </w:p>
-        </w:tc>
-        <w:tc>
-          <w:p>
-            <w:pPr>
-              <w:pStyle w:val="Compact"/>
-              <w:jc w:val="left"/>
-            </w:pPr>
-            <w:r>
-              <w:t xml:space="preserve">Kode pipeline ML berhenti di PR</w:t>
-            </w:r>
-          </w:p>
-        </w:tc>
-      </w:tr>
-      <w:tr>
-        <w:tc>
-          <w:p>
-            <w:pPr>
-              <w:pStyle w:val="Compact"/>
-              <w:jc w:val="left"/>
-            </w:pPr>
-            <w:r>
-              <w:t xml:space="preserve">P1</w:t>
-            </w:r>
-          </w:p>
-        </w:tc>
-        <w:tc>
-          <w:p>
-            <w:pPr>
-              <w:pStyle w:val="Compact"/>
-              <w:jc w:val="left"/>
-            </w:pPr>
-            <w:r>
-              <w:t xml:space="preserve">E4.1–E4.2</w:t>
-            </w:r>
-          </w:p>
-        </w:tc>
-        <w:tc>
-          <w:p>
-            <w:pPr>
-              <w:pStyle w:val="Compact"/>
-              <w:jc w:val="left"/>
-            </w:pPr>
-            <w:r>
-              <w:t xml:space="preserve">Ahmad</w:t>
-            </w:r>
-          </w:p>
-        </w:tc>
-        <w:tc>
-          <w:p>
-            <w:pPr>
-              <w:pStyle w:val="Compact"/>
-              <w:jc w:val="left"/>
-            </w:pPr>
-            <w:r>
-              <w:t xml:space="preserve">Jalur kritis jangka panjang, lead time unduh</w:t>
-            </w:r>
-          </w:p>
-        </w:tc>
-      </w:tr>
-      <w:tr>
-        <w:tc>
-          <w:p>
-            <w:pPr>
-              <w:pStyle w:val="Compact"/>
-              <w:jc w:val="left"/>
-            </w:pPr>
-            <w:r>
-              <w:t xml:space="preserve">P2</w:t>
-            </w:r>
-          </w:p>
-        </w:tc>
-        <w:tc>
-          <w:p>
-            <w:pPr>
-              <w:pStyle w:val="Compact"/>
-              <w:jc w:val="left"/>
-            </w:pPr>
-            <w:r>
-              <w:t xml:space="preserve">E2.3, E3.2, E3.3, E5.2, E8.6</w:t>
-            </w:r>
-          </w:p>
-        </w:tc>
-        <w:tc>
-          <w:p>
-            <w:pPr>
-              <w:pStyle w:val="Compact"/>
-              <w:jc w:val="left"/>
-            </w:pPr>
-            <w:r>
-              <w:t xml:space="preserve">Pras, Bisma, Abim, Izza</w:t>
-            </w:r>
-          </w:p>
-        </w:tc>
-        <w:tc>
-          <w:p>
-            <w:pPr>
-              <w:pStyle w:val="Compact"/>
-              <w:jc w:val="left"/>
-            </w:pPr>
-            <w:r>
-              <w:t xml:space="preserve">Lanjutan setelah P0</w:t>
-            </w:r>
-          </w:p>
-        </w:tc>
-      </w:tr>
-      <w:tr>
-        <w:tc>
-          <w:p>
-            <w:pPr>
-              <w:pStyle w:val="Compact"/>
-              <w:jc w:val="left"/>
-            </w:pPr>
-            <w:r>
-              <w:t xml:space="preserve">Ditunda</w:t>
-            </w:r>
-          </w:p>
-        </w:tc>
-        <w:tc>
-          <w:p>
-            <w:pPr>
-              <w:pStyle w:val="Compact"/>
-              <w:jc w:val="left"/>
-            </w:pPr>
-            <w:r>
-              <w:t xml:space="preserve">E4.3–E4.6, E6.</w:t>
-            </w:r>
-            <w:r>
-              <w:rPr>
-                <w:iCs/>
-                <w:i/>
-              </w:rPr>
-              <w:t xml:space="preserve">, E7.</w:t>
-            </w:r>
-          </w:p>
-        </w:tc>
-        <w:tc>
-          <w:p>
-            <w:pPr>
-              <w:pStyle w:val="Compact"/>
-              <w:jc w:val="left"/>
-            </w:pPr>
-            <w:r>
-              <w:t xml:space="preserve">—</w:t>
-            </w:r>
-          </w:p>
-        </w:tc>
-        <w:tc>
-          <w:p>
-            <w:pPr>
-              <w:pStyle w:val="Compact"/>
-              <w:jc w:val="left"/>
-            </w:pPr>
-            <w:r>
-              <w:t xml:space="preserve">Menunggu data dan artefak model</w:t>
+              <w:t xml:space="preserve">E8.7 halaman Profil, E8.2 simpan outfit, E8.4 konten Home</w:t>
+            </w:r>
+          </w:p>
+        </w:tc>
+        <w:tc>
+          <w:p>
+            <w:pPr>
+              <w:pStyle w:val="Compact"/>
+              <w:jc w:val="right"/>
+            </w:pPr>
+            <w:r>
+              <w:t xml:space="preserve">4,5</w:t>
             </w:r>
           </w:p>
         </w:tc>
@@ -710,6 +503,100 @@
               <w:jc w:val="left"/>
             </w:pPr>
             <w:r>
+              <w:t xml:space="preserve">Ahmad</w:t>
+            </w:r>
+          </w:p>
+        </w:tc>
+        <w:tc>
+          <w:p>
+            <w:pPr>
+              <w:pStyle w:val="Compact"/>
+              <w:jc w:val="left"/>
+            </w:pPr>
+            <w:r>
+              <w:t xml:space="preserve">Siapkan skema SQL</w:t>
+            </w:r>
+            <w:r>
+              <w:t xml:space="preserve"> </w:t>
+            </w:r>
+            <w:r>
+              <w:rPr>
+                <w:rStyle w:val="VerbatimChar"/>
+              </w:rPr>
+              <w:t xml:space="preserve">outfits</w:t>
+            </w:r>
+            <w:r>
+              <w:t xml:space="preserve"> </w:t>
+            </w:r>
+            <w:r>
+              <w:t xml:space="preserve">dan</w:t>
+            </w:r>
+            <w:r>
+              <w:t xml:space="preserve"> </w:t>
+            </w:r>
+            <w:r>
+              <w:rPr>
+                <w:rStyle w:val="VerbatimChar"/>
+              </w:rPr>
+              <w:t xml:space="preserve">recommendation_history</w:t>
+            </w:r>
+          </w:p>
+        </w:tc>
+        <w:tc>
+          <w:p>
+            <w:pPr>
+              <w:pStyle w:val="Compact"/>
+              <w:jc w:val="left"/>
+            </w:pPr>
+            <w:r>
+              <w:t xml:space="preserve">Rancangan tabel siap, menunggu E2.1</w:t>
+            </w:r>
+          </w:p>
+        </w:tc>
+      </w:tr>
+      <w:tr>
+        <w:tc>
+          <w:p>
+            <w:pPr>
+              <w:pStyle w:val="Compact"/>
+              <w:jc w:val="left"/>
+            </w:pPr>
+            <w:r>
+              <w:t xml:space="preserve">Izza</w:t>
+            </w:r>
+          </w:p>
+        </w:tc>
+        <w:tc>
+          <w:p>
+            <w:pPr>
+              <w:pStyle w:val="Compact"/>
+              <w:jc w:val="left"/>
+            </w:pPr>
+            <w:r>
+              <w:t xml:space="preserve">Rancangan layar dan skema master data E8.6</w:t>
+            </w:r>
+          </w:p>
+        </w:tc>
+        <w:tc>
+          <w:p>
+            <w:pPr>
+              <w:pStyle w:val="Compact"/>
+              <w:jc w:val="left"/>
+            </w:pPr>
+            <w:r>
+              <w:t xml:space="preserve">Rancangan disetujui</w:t>
+            </w:r>
+          </w:p>
+        </w:tc>
+      </w:tr>
+      <w:tr>
+        <w:tc>
+          <w:p>
+            <w:pPr>
+              <w:pStyle w:val="Compact"/>
+              <w:jc w:val="left"/>
+            </w:pPr>
+            <w:r>
               <w:t xml:space="preserve">Abim</w:t>
             </w:r>
           </w:p>
@@ -721,88 +608,18 @@
               <w:jc w:val="left"/>
             </w:pPr>
             <w:r>
-              <w:t xml:space="preserve">E5.1 crop tengah + thresholding latar</w:t>
-            </w:r>
-          </w:p>
-        </w:tc>
-        <w:tc>
-          <w:p>
-            <w:pPr>
-              <w:pStyle w:val="Compact"/>
-              <w:jc w:val="left"/>
-            </w:pPr>
-            <w:r>
-              <w:t xml:space="preserve">Crop berjalan pada 5 sampel</w:t>
-            </w:r>
-          </w:p>
-        </w:tc>
-      </w:tr>
-      <w:tr>
-        <w:tc>
-          <w:p>
-            <w:pPr>
-              <w:pStyle w:val="Compact"/>
-              <w:jc w:val="left"/>
-            </w:pPr>
-            <w:r>
-              <w:t xml:space="preserve">Izza</w:t>
-            </w:r>
-          </w:p>
-        </w:tc>
-        <w:tc>
-          <w:p>
-            <w:pPr>
-              <w:pStyle w:val="Compact"/>
-              <w:jc w:val="left"/>
-            </w:pPr>
-            <w:r>
-              <w:t xml:space="preserve">Mulai E10.2 foto lapangan</w:t>
-            </w:r>
-          </w:p>
-        </w:tc>
-        <w:tc>
-          <w:p>
-            <w:pPr>
-              <w:pStyle w:val="Compact"/>
-              <w:jc w:val="left"/>
-            </w:pPr>
-            <w:r>
-              <w:t xml:space="preserve">20 foto pertama</w:t>
-            </w:r>
-          </w:p>
-        </w:tc>
-      </w:tr>
-      <w:tr>
-        <w:tc>
-          <w:p>
-            <w:pPr>
-              <w:pStyle w:val="Compact"/>
-              <w:jc w:val="left"/>
-            </w:pPr>
-            <w:r>
-              <w:t xml:space="preserve">Ahmad</w:t>
-            </w:r>
-          </w:p>
-        </w:tc>
-        <w:tc>
-          <w:p>
-            <w:pPr>
-              <w:pStyle w:val="Compact"/>
-              <w:jc w:val="left"/>
-            </w:pPr>
-            <w:r>
-              <w:t xml:space="preserve">Review PR #3 + mulai unduh 3 dataset</w:t>
-            </w:r>
-          </w:p>
-        </w:tc>
-        <w:tc>
-          <w:p>
-            <w:pPr>
-              <w:pStyle w:val="Compact"/>
-              <w:jc w:val="left"/>
-            </w:pPr>
-            <w:r>
-              <w:t xml:space="preserve">Komentar review, unduhan berjalan</w:t>
+              <w:t xml:space="preserve">Rangka UI statis halaman Profil (E8.7)</w:t>
+            </w:r>
+          </w:p>
+        </w:tc>
+        <w:tc>
+          <w:p>
+            <w:pPr>
+              <w:pStyle w:val="Compact"/>
+              <w:jc w:val="left"/>
+            </w:pPr>
+            <w:r>
+              <w:t xml:space="preserve">Tampilan jadi, belum tersambung</w:t>
             </w:r>
           </w:p>
         </w:tc>
@@ -899,7 +716,7 @@
               <w:jc w:val="left"/>
             </w:pPr>
             <w:r>
-              <w:t xml:space="preserve">Insert, ambil, hapus berjalan</w:t>
+              <w:t xml:space="preserve">Tambah, ambil, hapus berjalan</w:t>
             </w:r>
           </w:p>
         </w:tc>
@@ -962,6 +779,76 @@
               <w:jc w:val="left"/>
             </w:pPr>
             <w:r>
+              <w:t xml:space="preserve">Ahmad</w:t>
+            </w:r>
+          </w:p>
+        </w:tc>
+        <w:tc>
+          <w:p>
+            <w:pPr>
+              <w:pStyle w:val="Compact"/>
+              <w:jc w:val="left"/>
+            </w:pPr>
+            <w:r>
+              <w:t xml:space="preserve">E2.4 implementasi tabel + DAO</w:t>
+            </w:r>
+          </w:p>
+        </w:tc>
+        <w:tc>
+          <w:p>
+            <w:pPr>
+              <w:pStyle w:val="Compact"/>
+              <w:jc w:val="left"/>
+            </w:pPr>
+            <w:r>
+              <w:t xml:space="preserve">Simpan dan daftar outfit berhasil</w:t>
+            </w:r>
+          </w:p>
+        </w:tc>
+      </w:tr>
+      <w:tr>
+        <w:tc>
+          <w:p>
+            <w:pPr>
+              <w:pStyle w:val="Compact"/>
+              <w:jc w:val="left"/>
+            </w:pPr>
+            <w:r>
+              <w:t xml:space="preserve">Izza</w:t>
+            </w:r>
+          </w:p>
+        </w:tc>
+        <w:tc>
+          <w:p>
+            <w:pPr>
+              <w:pStyle w:val="Compact"/>
+              <w:jc w:val="left"/>
+            </w:pPr>
+            <w:r>
+              <w:t xml:space="preserve">E8.6 implementasi (setelah E2.1)</w:t>
+            </w:r>
+          </w:p>
+        </w:tc>
+        <w:tc>
+          <w:p>
+            <w:pPr>
+              <w:pStyle w:val="Compact"/>
+              <w:jc w:val="left"/>
+            </w:pPr>
+            <w:r>
+              <w:t xml:space="preserve">Admin membaca master data</w:t>
+            </w:r>
+          </w:p>
+        </w:tc>
+      </w:tr>
+      <w:tr>
+        <w:tc>
+          <w:p>
+            <w:pPr>
+              <w:pStyle w:val="Compact"/>
+              <w:jc w:val="left"/>
+            </w:pPr>
+            <w:r>
               <w:t xml:space="preserve">Abim</w:t>
             </w:r>
           </w:p>
@@ -973,88 +860,18 @@
               <w:jc w:val="left"/>
             </w:pPr>
             <w:r>
-              <w:t xml:space="preserve">Selesaikan E5.1, mulai E5.2 K-Means</w:t>
-            </w:r>
-          </w:p>
-        </w:tc>
-        <w:tc>
-          <w:p>
-            <w:pPr>
-              <w:pStyle w:val="Compact"/>
-              <w:jc w:val="left"/>
-            </w:pPr>
-            <w:r>
-              <w:t xml:space="preserve">Crop final, kerangka K-Means</w:t>
-            </w:r>
-          </w:p>
-        </w:tc>
-      </w:tr>
-      <w:tr>
-        <w:tc>
-          <w:p>
-            <w:pPr>
-              <w:pStyle w:val="Compact"/>
-              <w:jc w:val="left"/>
-            </w:pPr>
-            <w:r>
-              <w:t xml:space="preserve">Izza</w:t>
-            </w:r>
-          </w:p>
-        </w:tc>
-        <w:tc>
-          <w:p>
-            <w:pPr>
-              <w:pStyle w:val="Compact"/>
-              <w:jc w:val="left"/>
-            </w:pPr>
-            <w:r>
-              <w:t xml:space="preserve">E8.6 rancangan master data</w:t>
-            </w:r>
-          </w:p>
-        </w:tc>
-        <w:tc>
-          <w:p>
-            <w:pPr>
-              <w:pStyle w:val="Compact"/>
-              <w:jc w:val="left"/>
-            </w:pPr>
-            <w:r>
-              <w:t xml:space="preserve">Rancangan tabel dan layar</w:t>
-            </w:r>
-          </w:p>
-        </w:tc>
-      </w:tr>
-      <w:tr>
-        <w:tc>
-          <w:p>
-            <w:pPr>
-              <w:pStyle w:val="Compact"/>
-              <w:jc w:val="left"/>
-            </w:pPr>
-            <w:r>
-              <w:t xml:space="preserve">Ahmad</w:t>
-            </w:r>
-          </w:p>
-        </w:tc>
-        <w:tc>
-          <w:p>
-            <w:pPr>
-              <w:pStyle w:val="Compact"/>
-              <w:jc w:val="left"/>
-            </w:pPr>
-            <w:r>
-              <w:t xml:space="preserve">Review PR #3 selesai, mulai E9.1</w:t>
-            </w:r>
-          </w:p>
-        </w:tc>
-        <w:tc>
-          <w:p>
-            <w:pPr>
-              <w:pStyle w:val="Compact"/>
-              <w:jc w:val="left"/>
-            </w:pPr>
-            <w:r>
-              <w:t xml:space="preserve">PR siap digabung, kerangka test case</w:t>
+              <w:t xml:space="preserve">Lanjut E8.7 + siapkan integrasi data</w:t>
+            </w:r>
+          </w:p>
+        </w:tc>
+        <w:tc>
+          <w:p>
+            <w:pPr>
+              <w:pStyle w:val="Compact"/>
+              <w:jc w:val="left"/>
+            </w:pPr>
+            <w:r>
+              <w:t xml:space="preserve">UI shell selesai</w:t>
             </w:r>
           </w:p>
         </w:tc>
@@ -1166,31 +983,7 @@
               <w:jc w:val="left"/>
             </w:pPr>
             <w:r>
-              <w:t xml:space="preserve">E3.2 record cloud</w:t>
-            </w:r>
-            <w:r>
-              <w:t xml:space="preserve"> </w:t>
-            </w:r>
-            <w:r>
-              <w:rPr>
-                <w:rStyle w:val="VerbatimChar"/>
-              </w:rPr>
-              <w:t xml:space="preserve">users</w:t>
-            </w:r>
-            <w:r>
-              <w:t xml:space="preserve"> </w:t>
-            </w:r>
-            <w:r>
-              <w:t xml:space="preserve">+</w:t>
-            </w:r>
-            <w:r>
-              <w:t xml:space="preserve"> </w:t>
-            </w:r>
-            <w:r>
-              <w:rPr>
-                <w:rStyle w:val="VerbatimChar"/>
-              </w:rPr>
-              <w:t xml:space="preserve">profiles</w:t>
+              <w:t xml:space="preserve">Uji E3.1 + E3.2 record cloud</w:t>
             </w:r>
           </w:p>
         </w:tc>
@@ -1214,6 +1007,76 @@
               <w:jc w:val="left"/>
             </w:pPr>
             <w:r>
+              <w:t xml:space="preserve">Ahmad</w:t>
+            </w:r>
+          </w:p>
+        </w:tc>
+        <w:tc>
+          <w:p>
+            <w:pPr>
+              <w:pStyle w:val="Compact"/>
+              <w:jc w:val="left"/>
+            </w:pPr>
+            <w:r>
+              <w:t xml:space="preserve">Selesaikan E2.4</w:t>
+            </w:r>
+          </w:p>
+        </w:tc>
+        <w:tc>
+          <w:p>
+            <w:pPr>
+              <w:pStyle w:val="Compact"/>
+              <w:jc w:val="left"/>
+            </w:pPr>
+            <w:r>
+              <w:t xml:space="preserve">DAO outfit dan riwayat lulus uji manual</w:t>
+            </w:r>
+          </w:p>
+        </w:tc>
+      </w:tr>
+      <w:tr>
+        <w:tc>
+          <w:p>
+            <w:pPr>
+              <w:pStyle w:val="Compact"/>
+              <w:jc w:val="left"/>
+            </w:pPr>
+            <w:r>
+              <w:t xml:space="preserve">Izza</w:t>
+            </w:r>
+          </w:p>
+        </w:tc>
+        <w:tc>
+          <w:p>
+            <w:pPr>
+              <w:pStyle w:val="Compact"/>
+              <w:jc w:val="left"/>
+            </w:pPr>
+            <w:r>
+              <w:t xml:space="preserve">Selesaikan E8.6</w:t>
+            </w:r>
+          </w:p>
+        </w:tc>
+        <w:tc>
+          <w:p>
+            <w:pPr>
+              <w:pStyle w:val="Compact"/>
+              <w:jc w:val="left"/>
+            </w:pPr>
+            <w:r>
+              <w:t xml:space="preserve">Master data dapat dikelola</w:t>
+            </w:r>
+          </w:p>
+        </w:tc>
+      </w:tr>
+      <w:tr>
+        <w:tc>
+          <w:p>
+            <w:pPr>
+              <w:pStyle w:val="Compact"/>
+              <w:jc w:val="left"/>
+            </w:pPr>
+            <w:r>
               <w:t xml:space="preserve">Abim</w:t>
             </w:r>
           </w:p>
@@ -1225,88 +1088,18 @@
               <w:jc w:val="left"/>
             </w:pPr>
             <w:r>
-              <w:t xml:space="preserve">E5.2 K-Means (k=3–5) Lab/HSV</w:t>
-            </w:r>
-          </w:p>
-        </w:tc>
-        <w:tc>
-          <w:p>
-            <w:pPr>
-              <w:pStyle w:val="Compact"/>
-              <w:jc w:val="left"/>
-            </w:pPr>
-            <w:r>
-              <w:t xml:space="preserve">Warna dominan benar pada 5 sampel</w:t>
-            </w:r>
-          </w:p>
-        </w:tc>
-      </w:tr>
-      <w:tr>
-        <w:tc>
-          <w:p>
-            <w:pPr>
-              <w:pStyle w:val="Compact"/>
-              <w:jc w:val="left"/>
-            </w:pPr>
-            <w:r>
-              <w:t xml:space="preserve">Izza</w:t>
-            </w:r>
-          </w:p>
-        </w:tc>
-        <w:tc>
-          <w:p>
-            <w:pPr>
-              <w:pStyle w:val="Compact"/>
-              <w:jc w:val="left"/>
-            </w:pPr>
-            <w:r>
-              <w:t xml:space="preserve">E8.6 implementasi (setelah E2.1)</w:t>
-            </w:r>
-          </w:p>
-        </w:tc>
-        <w:tc>
-          <w:p>
-            <w:pPr>
-              <w:pStyle w:val="Compact"/>
-              <w:jc w:val="left"/>
-            </w:pPr>
-            <w:r>
-              <w:t xml:space="preserve">Layar admin membaca master data</w:t>
-            </w:r>
-          </w:p>
-        </w:tc>
-      </w:tr>
-      <w:tr>
-        <w:tc>
-          <w:p>
-            <w:pPr>
-              <w:pStyle w:val="Compact"/>
-              <w:jc w:val="left"/>
-            </w:pPr>
-            <w:r>
-              <w:t xml:space="preserve">Ahmad</w:t>
-            </w:r>
-          </w:p>
-        </w:tc>
-        <w:tc>
-          <w:p>
-            <w:pPr>
-              <w:pStyle w:val="Compact"/>
-              <w:jc w:val="left"/>
-            </w:pPr>
-            <w:r>
-              <w:t xml:space="preserve">E9.1 minimal 20 test case</w:t>
-            </w:r>
-          </w:p>
-        </w:tc>
-        <w:tc>
-          <w:p>
-            <w:pPr>
-              <w:pStyle w:val="Compact"/>
-              <w:jc w:val="left"/>
-            </w:pPr>
-            <w:r>
-              <w:t xml:space="preserve">Dokumen rencana uji</w:t>
+              <w:t xml:space="preserve">Mulai E8.2 (setelah E2.4)</w:t>
+            </w:r>
+          </w:p>
+        </w:tc>
+        <w:tc>
+          <w:p>
+            <w:pPr>
+              <w:pStyle w:val="Compact"/>
+              <w:jc w:val="left"/>
+            </w:pPr>
+            <w:r>
+              <w:t xml:space="preserve">Form simpan outfit</w:t>
             </w:r>
           </w:p>
         </w:tc>
@@ -1383,42 +1176,18 @@
               <w:jc w:val="left"/>
             </w:pPr>
             <w:r>
-              <w:t xml:space="preserve">E2.4 tabel</w:t>
-            </w:r>
-            <w:r>
-              <w:t xml:space="preserve"> </w:t>
-            </w:r>
-            <w:r>
-              <w:rPr>
-                <w:rStyle w:val="VerbatimChar"/>
-              </w:rPr>
-              <w:t xml:space="preserve">outfits</w:t>
-            </w:r>
-            <w:r>
-              <w:t xml:space="preserve"> </w:t>
-            </w:r>
-            <w:r>
-              <w:t xml:space="preserve">+</w:t>
-            </w:r>
-            <w:r>
-              <w:t xml:space="preserve"> </w:t>
-            </w:r>
-            <w:r>
-              <w:rPr>
-                <w:rStyle w:val="VerbatimChar"/>
-              </w:rPr>
-              <w:t xml:space="preserve">recommendation_history</w:t>
-            </w:r>
-          </w:p>
-        </w:tc>
-        <w:tc>
-          <w:p>
-            <w:pPr>
-              <w:pStyle w:val="Compact"/>
-              <w:jc w:val="left"/>
-            </w:pPr>
-            <w:r>
-              <w:t xml:space="preserve">DAO outfit dan riwayat</w:t>
+              <w:t xml:space="preserve">Review PR E2 + bantu Izza</w:t>
+            </w:r>
+          </w:p>
+        </w:tc>
+        <w:tc>
+          <w:p>
+            <w:pPr>
+              <w:pStyle w:val="Compact"/>
+              <w:jc w:val="left"/>
+            </w:pPr>
+            <w:r>
+              <w:t xml:space="preserve">PR E2 siap digabung</w:t>
             </w:r>
           </w:p>
         </w:tc>
@@ -1466,6 +1235,76 @@
               <w:jc w:val="left"/>
             </w:pPr>
             <w:r>
+              <w:t xml:space="preserve">Ahmad</w:t>
+            </w:r>
+          </w:p>
+        </w:tc>
+        <w:tc>
+          <w:p>
+            <w:pPr>
+              <w:pStyle w:val="Compact"/>
+              <w:jc w:val="left"/>
+            </w:pPr>
+            <w:r>
+              <w:t xml:space="preserve">E2.5 muat lemari dan riwayat saat start</w:t>
+            </w:r>
+          </w:p>
+        </w:tc>
+        <w:tc>
+          <w:p>
+            <w:pPr>
+              <w:pStyle w:val="Compact"/>
+              <w:jc w:val="left"/>
+            </w:pPr>
+            <w:r>
+              <w:t xml:space="preserve">Data muncul setelah cold start</w:t>
+            </w:r>
+          </w:p>
+        </w:tc>
+      </w:tr>
+      <w:tr>
+        <w:tc>
+          <w:p>
+            <w:pPr>
+              <w:pStyle w:val="Compact"/>
+              <w:jc w:val="left"/>
+            </w:pPr>
+            <w:r>
+              <w:t xml:space="preserve">Izza</w:t>
+            </w:r>
+          </w:p>
+        </w:tc>
+        <w:tc>
+          <w:p>
+            <w:pPr>
+              <w:pStyle w:val="Compact"/>
+              <w:jc w:val="left"/>
+            </w:pPr>
+            <w:r>
+              <w:t xml:space="preserve">Mulai E8.1 (setelah E2.2)</w:t>
+            </w:r>
+          </w:p>
+        </w:tc>
+        <w:tc>
+          <w:p>
+            <w:pPr>
+              <w:pStyle w:val="Compact"/>
+              <w:jc w:val="left"/>
+            </w:pPr>
+            <w:r>
+              <w:t xml:space="preserve">Daftar item dan form tambah</w:t>
+            </w:r>
+          </w:p>
+        </w:tc>
+      </w:tr>
+      <w:tr>
+        <w:tc>
+          <w:p>
+            <w:pPr>
+              <w:pStyle w:val="Compact"/>
+              <w:jc w:val="left"/>
+            </w:pPr>
+            <w:r>
               <w:t xml:space="preserve">Abim</w:t>
             </w:r>
           </w:p>
@@ -1477,88 +1316,18 @@
               <w:jc w:val="left"/>
             </w:pPr>
             <w:r>
-              <w:t xml:space="preserve">E5.2 lanjutan</w:t>
-            </w:r>
-          </w:p>
-        </w:tc>
-        <w:tc>
-          <w:p>
-            <w:pPr>
-              <w:pStyle w:val="Compact"/>
-              <w:jc w:val="left"/>
-            </w:pPr>
-            <w:r>
-              <w:t xml:space="preserve">Warna dominan stabil pada 8 dari 10 sampel</w:t>
-            </w:r>
-          </w:p>
-        </w:tc>
-      </w:tr>
-      <w:tr>
-        <w:tc>
-          <w:p>
-            <w:pPr>
-              <w:pStyle w:val="Compact"/>
-              <w:jc w:val="left"/>
-            </w:pPr>
-            <w:r>
-              <w:t xml:space="preserve">Izza</w:t>
-            </w:r>
-          </w:p>
-        </w:tc>
-        <w:tc>
-          <w:p>
-            <w:pPr>
-              <w:pStyle w:val="Compact"/>
-              <w:jc w:val="left"/>
-            </w:pPr>
-            <w:r>
-              <w:t xml:space="preserve">E8.1 mulai CRUD UI Lemari</w:t>
-            </w:r>
-          </w:p>
-        </w:tc>
-        <w:tc>
-          <w:p>
-            <w:pPr>
-              <w:pStyle w:val="Compact"/>
-              <w:jc w:val="left"/>
-            </w:pPr>
-            <w:r>
-              <w:t xml:space="preserve">Form tambah dan daftar item</w:t>
-            </w:r>
-          </w:p>
-        </w:tc>
-      </w:tr>
-      <w:tr>
-        <w:tc>
-          <w:p>
-            <w:pPr>
-              <w:pStyle w:val="Compact"/>
-              <w:jc w:val="left"/>
-            </w:pPr>
-            <w:r>
-              <w:t xml:space="preserve">Ahmad</w:t>
-            </w:r>
-          </w:p>
-        </w:tc>
-        <w:tc>
-          <w:p>
-            <w:pPr>
-              <w:pStyle w:val="Compact"/>
-              <w:jc w:val="left"/>
-            </w:pPr>
-            <w:r>
-              <w:t xml:space="preserve">E4.1 EDA + mulai E10.5 dokumentasi</w:t>
-            </w:r>
-          </w:p>
-        </w:tc>
-        <w:tc>
-          <w:p>
-            <w:pPr>
-              <w:pStyle w:val="Compact"/>
-              <w:jc w:val="left"/>
-            </w:pPr>
-            <w:r>
-              <w:t xml:space="preserve">Laporan EDA singkat</w:t>
+              <w:t xml:space="preserve">Lanjut E8.2</w:t>
+            </w:r>
+          </w:p>
+        </w:tc>
+        <w:tc>
+          <w:p>
+            <w:pPr>
+              <w:pStyle w:val="Compact"/>
+              <w:jc w:val="left"/>
+            </w:pPr>
+            <w:r>
+              <w:t xml:space="preserve">Outfit tersimpan terdaftar</w:t>
             </w:r>
           </w:p>
         </w:tc>
@@ -1635,18 +1404,18 @@
               <w:jc w:val="left"/>
             </w:pPr>
             <w:r>
-              <w:t xml:space="preserve">E2.5 muat data saat start</w:t>
-            </w:r>
-          </w:p>
-        </w:tc>
-        <w:tc>
-          <w:p>
-            <w:pPr>
-              <w:pStyle w:val="Compact"/>
-              <w:jc w:val="left"/>
-            </w:pPr>
-            <w:r>
-              <w:t xml:space="preserve">Data muncul setelah cold start</w:t>
+              <w:t xml:space="preserve">Bantu E8.1 bagian filter</w:t>
+            </w:r>
+          </w:p>
+        </w:tc>
+        <w:tc>
+          <w:p>
+            <w:pPr>
+              <w:pStyle w:val="Compact"/>
+              <w:jc w:val="left"/>
+            </w:pPr>
+            <w:r>
+              <w:t xml:space="preserve">Filter berjalan</w:t>
             </w:r>
           </w:p>
         </w:tc>
@@ -1670,7 +1439,7 @@
               <w:jc w:val="left"/>
             </w:pPr>
             <w:r>
-              <w:t xml:space="preserve">E3.4 sign out + jalur hapus akun</w:t>
+              <w:t xml:space="preserve">E3.4 sign out + hapus akun</w:t>
             </w:r>
           </w:p>
         </w:tc>
@@ -1694,6 +1463,76 @@
               <w:jc w:val="left"/>
             </w:pPr>
             <w:r>
+              <w:t xml:space="preserve">Ahmad</w:t>
+            </w:r>
+          </w:p>
+        </w:tc>
+        <w:tc>
+          <w:p>
+            <w:pPr>
+              <w:pStyle w:val="Compact"/>
+              <w:jc w:val="left"/>
+            </w:pPr>
+            <w:r>
+              <w:t xml:space="preserve">E2.6 unit test DAO</w:t>
+            </w:r>
+          </w:p>
+        </w:tc>
+        <w:tc>
+          <w:p>
+            <w:pPr>
+              <w:pStyle w:val="Compact"/>
+              <w:jc w:val="left"/>
+            </w:pPr>
+            <w:r>
+              <w:t xml:space="preserve">Test lulus</w:t>
+            </w:r>
+          </w:p>
+        </w:tc>
+      </w:tr>
+      <w:tr>
+        <w:tc>
+          <w:p>
+            <w:pPr>
+              <w:pStyle w:val="Compact"/>
+              <w:jc w:val="left"/>
+            </w:pPr>
+            <w:r>
+              <w:t xml:space="preserve">Izza</w:t>
+            </w:r>
+          </w:p>
+        </w:tc>
+        <w:tc>
+          <w:p>
+            <w:pPr>
+              <w:pStyle w:val="Compact"/>
+              <w:jc w:val="left"/>
+            </w:pPr>
+            <w:r>
+              <w:t xml:space="preserve">E8.1 empty state dan hapus item</w:t>
+            </w:r>
+          </w:p>
+        </w:tc>
+        <w:tc>
+          <w:p>
+            <w:pPr>
+              <w:pStyle w:val="Compact"/>
+              <w:jc w:val="left"/>
+            </w:pPr>
+            <w:r>
+              <w:t xml:space="preserve">CRUD penuh berjalan</w:t>
+            </w:r>
+          </w:p>
+        </w:tc>
+      </w:tr>
+      <w:tr>
+        <w:tc>
+          <w:p>
+            <w:pPr>
+              <w:pStyle w:val="Compact"/>
+              <w:jc w:val="left"/>
+            </w:pPr>
+            <w:r>
               <w:t xml:space="preserve">Abim</w:t>
             </w:r>
           </w:p>
@@ -1705,88 +1544,18 @@
               <w:jc w:val="left"/>
             </w:pPr>
             <w:r>
-              <w:t xml:space="preserve">E5.3 palet 14 warna</w:t>
-            </w:r>
-          </w:p>
-        </w:tc>
-        <w:tc>
-          <w:p>
-            <w:pPr>
-              <w:pStyle w:val="Compact"/>
-              <w:jc w:val="left"/>
-            </w:pPr>
-            <w:r>
-              <w:t xml:space="preserve">Nama warna sesuai sampel</w:t>
-            </w:r>
-          </w:p>
-        </w:tc>
-      </w:tr>
-      <w:tr>
-        <w:tc>
-          <w:p>
-            <w:pPr>
-              <w:pStyle w:val="Compact"/>
-              <w:jc w:val="left"/>
-            </w:pPr>
-            <w:r>
-              <w:t xml:space="preserve">Izza</w:t>
-            </w:r>
-          </w:p>
-        </w:tc>
-        <w:tc>
-          <w:p>
-            <w:pPr>
-              <w:pStyle w:val="Compact"/>
-              <w:jc w:val="left"/>
-            </w:pPr>
-            <w:r>
-              <w:t xml:space="preserve">E8.1 filter dan empty state</w:t>
-            </w:r>
-          </w:p>
-        </w:tc>
-        <w:tc>
-          <w:p>
-            <w:pPr>
-              <w:pStyle w:val="Compact"/>
-              <w:jc w:val="left"/>
-            </w:pPr>
-            <w:r>
-              <w:t xml:space="preserve">CRUD penuh berjalan</w:t>
-            </w:r>
-          </w:p>
-        </w:tc>
-      </w:tr>
-      <w:tr>
-        <w:tc>
-          <w:p>
-            <w:pPr>
-              <w:pStyle w:val="Compact"/>
-              <w:jc w:val="left"/>
-            </w:pPr>
-            <w:r>
-              <w:t xml:space="preserve">Ahmad</w:t>
-            </w:r>
-          </w:p>
-        </w:tc>
-        <w:tc>
-          <w:p>
-            <w:pPr>
-              <w:pStyle w:val="Compact"/>
-              <w:jc w:val="left"/>
-            </w:pPr>
-            <w:r>
-              <w:t xml:space="preserve">E9.1 selesai + E4.2 split</w:t>
-            </w:r>
-          </w:p>
-        </w:tc>
-        <w:tc>
-          <w:p>
-            <w:pPr>
-              <w:pStyle w:val="Compact"/>
-              <w:jc w:val="left"/>
-            </w:pPr>
-            <w:r>
-              <w:t xml:space="preserve">20 test case final, split tersimpan</w:t>
+              <w:t xml:space="preserve">Mulai E8.4 (setelah E2.5)</w:t>
+            </w:r>
+          </w:p>
+        </w:tc>
+        <w:tc>
+          <w:p>
+            <w:pPr>
+              <w:pStyle w:val="Compact"/>
+              <w:jc w:val="left"/>
+            </w:pPr>
+            <w:r>
+              <w:t xml:space="preserve">Home memakai data nyata</w:t>
             </w:r>
           </w:p>
         </w:tc>
@@ -1863,18 +1632,18 @@
               <w:jc w:val="left"/>
             </w:pPr>
             <w:r>
-              <w:t xml:space="preserve">E2.6 unit test DAO</w:t>
-            </w:r>
-          </w:p>
-        </w:tc>
-        <w:tc>
-          <w:p>
-            <w:pPr>
-              <w:pStyle w:val="Compact"/>
-              <w:jc w:val="left"/>
-            </w:pPr>
-            <w:r>
-              <w:t xml:space="preserve">Test lulus</w:t>
+              <w:t xml:space="preserve">Rekap penyimpanan</w:t>
+            </w:r>
+          </w:p>
+        </w:tc>
+        <w:tc>
+          <w:p>
+            <w:pPr>
+              <w:pStyle w:val="Compact"/>
+              <w:jc w:val="left"/>
+            </w:pPr>
+            <w:r>
+              <w:t xml:space="preserve">Status terisi</w:t>
             </w:r>
           </w:p>
         </w:tc>
@@ -1898,18 +1667,88 @@
               <w:jc w:val="left"/>
             </w:pPr>
             <w:r>
-              <w:t xml:space="preserve">E8.7 halaman Profil</w:t>
-            </w:r>
-          </w:p>
-        </w:tc>
-        <w:tc>
-          <w:p>
-            <w:pPr>
-              <w:pStyle w:val="Compact"/>
-              <w:jc w:val="left"/>
-            </w:pPr>
-            <w:r>
-              <w:t xml:space="preserve">Profil dapat diedit</w:t>
+              <w:t xml:space="preserve">Uji akhir auth + rekap</w:t>
+            </w:r>
+          </w:p>
+        </w:tc>
+        <w:tc>
+          <w:p>
+            <w:pPr>
+              <w:pStyle w:val="Compact"/>
+              <w:jc w:val="left"/>
+            </w:pPr>
+            <w:r>
+              <w:t xml:space="preserve">Login, sesi, logout stabil</w:t>
+            </w:r>
+          </w:p>
+        </w:tc>
+      </w:tr>
+      <w:tr>
+        <w:tc>
+          <w:p>
+            <w:pPr>
+              <w:pStyle w:val="Compact"/>
+              <w:jc w:val="left"/>
+            </w:pPr>
+            <w:r>
+              <w:t xml:space="preserve">Ahmad</w:t>
+            </w:r>
+          </w:p>
+        </w:tc>
+        <w:tc>
+          <w:p>
+            <w:pPr>
+              <w:pStyle w:val="Compact"/>
+              <w:jc w:val="left"/>
+            </w:pPr>
+            <w:r>
+              <w:t xml:space="preserve">Rekap + perbarui Notion</w:t>
+            </w:r>
+          </w:p>
+        </w:tc>
+        <w:tc>
+          <w:p>
+            <w:pPr>
+              <w:pStyle w:val="Compact"/>
+              <w:jc w:val="left"/>
+            </w:pPr>
+            <w:r>
+              <w:t xml:space="preserve">Status terisi</w:t>
+            </w:r>
+          </w:p>
+        </w:tc>
+      </w:tr>
+      <w:tr>
+        <w:tc>
+          <w:p>
+            <w:pPr>
+              <w:pStyle w:val="Compact"/>
+              <w:jc w:val="left"/>
+            </w:pPr>
+            <w:r>
+              <w:t xml:space="preserve">Izza</w:t>
+            </w:r>
+          </w:p>
+        </w:tc>
+        <w:tc>
+          <w:p>
+            <w:pPr>
+              <w:pStyle w:val="Compact"/>
+              <w:jc w:val="left"/>
+            </w:pPr>
+            <w:r>
+              <w:t xml:space="preserve">Selesaikan E8.1 + logbook</w:t>
+            </w:r>
+          </w:p>
+        </w:tc>
+        <w:tc>
+          <w:p>
+            <w:pPr>
+              <w:pStyle w:val="Compact"/>
+              <w:jc w:val="left"/>
+            </w:pPr>
+            <w:r>
+              <w:t xml:space="preserve">Logbook minggu 5</w:t>
             </w:r>
           </w:p>
         </w:tc>
@@ -1933,88 +1772,18 @@
               <w:jc w:val="left"/>
             </w:pPr>
             <w:r>
-              <w:t xml:space="preserve">E5.4 unit test warna</w:t>
-            </w:r>
-          </w:p>
-        </w:tc>
-        <w:tc>
-          <w:p>
-            <w:pPr>
-              <w:pStyle w:val="Compact"/>
-              <w:jc w:val="left"/>
-            </w:pPr>
-            <w:r>
-              <w:t xml:space="preserve">Test lulus</w:t>
-            </w:r>
-          </w:p>
-        </w:tc>
-      </w:tr>
-      <w:tr>
-        <w:tc>
-          <w:p>
-            <w:pPr>
-              <w:pStyle w:val="Compact"/>
-              <w:jc w:val="left"/>
-            </w:pPr>
-            <w:r>
-              <w:t xml:space="preserve">Izza</w:t>
-            </w:r>
-          </w:p>
-        </w:tc>
-        <w:tc>
-          <w:p>
-            <w:pPr>
-              <w:pStyle w:val="Compact"/>
-              <w:jc w:val="left"/>
-            </w:pPr>
-            <w:r>
-              <w:t xml:space="preserve">E10.1 logbook minggu 5 + rekap</w:t>
-            </w:r>
-          </w:p>
-        </w:tc>
-        <w:tc>
-          <w:p>
-            <w:pPr>
-              <w:pStyle w:val="Compact"/>
-              <w:jc w:val="left"/>
-            </w:pPr>
-            <w:r>
-              <w:t xml:space="preserve">Logbook diperbarui</w:t>
-            </w:r>
-          </w:p>
-        </w:tc>
-      </w:tr>
-      <w:tr>
-        <w:tc>
-          <w:p>
-            <w:pPr>
-              <w:pStyle w:val="Compact"/>
-              <w:jc w:val="left"/>
-            </w:pPr>
-            <w:r>
-              <w:t xml:space="preserve">Ahmad</w:t>
-            </w:r>
-          </w:p>
-        </w:tc>
-        <w:tc>
-          <w:p>
-            <w:pPr>
-              <w:pStyle w:val="Compact"/>
-              <w:jc w:val="left"/>
-            </w:pPr>
-            <w:r>
-              <w:t xml:space="preserve">Rekap QA + perbarui papan Notion</w:t>
-            </w:r>
-          </w:p>
-        </w:tc>
-        <w:tc>
-          <w:p>
-            <w:pPr>
-              <w:pStyle w:val="Compact"/>
-              <w:jc w:val="left"/>
-            </w:pPr>
-            <w:r>
-              <w:t xml:space="preserve">Status terisi</w:t>
+              <w:t xml:space="preserve">Selesaikan E8.4 + uji alur</w:t>
+            </w:r>
+          </w:p>
+        </w:tc>
+        <w:tc>
+          <w:p>
+            <w:pPr>
+              <w:pStyle w:val="Compact"/>
+              <w:jc w:val="left"/>
+            </w:pPr>
+            <w:r>
+              <w:t xml:space="preserve">Home tanpa placeholder</w:t>
             </w:r>
           </w:p>
         </w:tc>
@@ -2079,6 +1848,17 @@
             </w:r>
           </w:p>
         </w:tc>
+        <w:tc>
+          <w:p>
+            <w:pPr>
+              <w:pStyle w:val="Compact"/>
+              <w:jc w:val="left"/>
+            </w:pPr>
+            <w:r>
+              <w:t xml:space="preserve">Target</w:t>
+            </w:r>
+          </w:p>
+        </w:tc>
       </w:tr>
       <w:tr>
         <w:tc>
@@ -2114,27 +1894,84 @@
             </w:r>
           </w:p>
         </w:tc>
-      </w:tr>
-      <w:tr>
-        <w:tc>
-          <w:p>
-            <w:pPr>
-              <w:pStyle w:val="Compact"/>
-              <w:jc w:val="left"/>
-            </w:pPr>
-            <w:r>
-              <w:t xml:space="preserve">E3.1–E3.3</w:t>
-            </w:r>
-          </w:p>
-        </w:tc>
-        <w:tc>
-          <w:p>
-            <w:pPr>
-              <w:pStyle w:val="Compact"/>
-              <w:jc w:val="left"/>
-            </w:pPr>
-            <w:r>
-              <w:t xml:space="preserve">Login Google berhasil, profil terbentuk, sesi bertahan setelah restart</w:t>
+        <w:tc>
+          <w:p>
+            <w:pPr>
+              <w:pStyle w:val="Compact"/>
+              <w:jc w:val="left"/>
+            </w:pPr>
+            <w:r>
+              <w:t xml:space="preserve">Selesai</w:t>
+            </w:r>
+          </w:p>
+        </w:tc>
+      </w:tr>
+      <w:tr>
+        <w:tc>
+          <w:p>
+            <w:pPr>
+              <w:pStyle w:val="Compact"/>
+              <w:jc w:val="left"/>
+            </w:pPr>
+            <w:r>
+              <w:t xml:space="preserve">E2.4–E2.6</w:t>
+            </w:r>
+          </w:p>
+        </w:tc>
+        <w:tc>
+          <w:p>
+            <w:pPr>
+              <w:pStyle w:val="Compact"/>
+              <w:jc w:val="left"/>
+            </w:pPr>
+            <w:r>
+              <w:t xml:space="preserve">Outfit dan riwayat tersimpan; data muncul saat start; test DAO lulus</w:t>
+            </w:r>
+          </w:p>
+        </w:tc>
+        <w:tc>
+          <w:p>
+            <w:pPr>
+              <w:pStyle w:val="Compact"/>
+              <w:jc w:val="left"/>
+            </w:pPr>
+            <w:r>
+              <w:t xml:space="preserve">Ahmad</w:t>
+            </w:r>
+          </w:p>
+        </w:tc>
+        <w:tc>
+          <w:p>
+            <w:pPr>
+              <w:pStyle w:val="Compact"/>
+              <w:jc w:val="left"/>
+            </w:pPr>
+            <w:r>
+              <w:t xml:space="preserve">Selesai</w:t>
+            </w:r>
+          </w:p>
+        </w:tc>
+      </w:tr>
+      <w:tr>
+        <w:tc>
+          <w:p>
+            <w:pPr>
+              <w:pStyle w:val="Compact"/>
+              <w:jc w:val="left"/>
+            </w:pPr>
+            <w:r>
+              <w:t xml:space="preserve">E3.1–E3.4</w:t>
+            </w:r>
+          </w:p>
+        </w:tc>
+        <w:tc>
+          <w:p>
+            <w:pPr>
+              <w:pStyle w:val="Compact"/>
+              <w:jc w:val="left"/>
+            </w:pPr>
+            <w:r>
+              <w:t xml:space="preserve">Login Google, profil cloud, sesi bertahan, logout bersih</w:t>
             </w:r>
           </w:p>
         </w:tc>
@@ -2149,27 +1986,130 @@
             </w:r>
           </w:p>
         </w:tc>
-      </w:tr>
-      <w:tr>
-        <w:tc>
-          <w:p>
-            <w:pPr>
-              <w:pStyle w:val="Compact"/>
-              <w:jc w:val="left"/>
-            </w:pPr>
-            <w:r>
-              <w:t xml:space="preserve">E5.1–E5.2</w:t>
-            </w:r>
-          </w:p>
-        </w:tc>
-        <w:tc>
-          <w:p>
-            <w:pPr>
-              <w:pStyle w:val="Compact"/>
-              <w:jc w:val="left"/>
-            </w:pPr>
-            <w:r>
-              <w:t xml:space="preserve">Crop berjalan; warna dominan benar pada minimal 8 dari 10 gambar uji</w:t>
+        <w:tc>
+          <w:p>
+            <w:pPr>
+              <w:pStyle w:val="Compact"/>
+              <w:jc w:val="left"/>
+            </w:pPr>
+            <w:r>
+              <w:t xml:space="preserve">Selesai</w:t>
+            </w:r>
+          </w:p>
+        </w:tc>
+      </w:tr>
+      <w:tr>
+        <w:tc>
+          <w:p>
+            <w:pPr>
+              <w:pStyle w:val="Compact"/>
+              <w:jc w:val="left"/>
+            </w:pPr>
+            <w:r>
+              <w:t xml:space="preserve">E8.6</w:t>
+            </w:r>
+          </w:p>
+        </w:tc>
+        <w:tc>
+          <w:p>
+            <w:pPr>
+              <w:pStyle w:val="Compact"/>
+              <w:jc w:val="left"/>
+            </w:pPr>
+            <w:r>
+              <w:t xml:space="preserve">Master data kategori dan jenis dapat dikelola</w:t>
+            </w:r>
+          </w:p>
+        </w:tc>
+        <w:tc>
+          <w:p>
+            <w:pPr>
+              <w:pStyle w:val="Compact"/>
+              <w:jc w:val="left"/>
+            </w:pPr>
+            <w:r>
+              <w:t xml:space="preserve">Izza</w:t>
+            </w:r>
+          </w:p>
+        </w:tc>
+        <w:tc>
+          <w:p>
+            <w:pPr>
+              <w:pStyle w:val="Compact"/>
+              <w:jc w:val="left"/>
+            </w:pPr>
+            <w:r>
+              <w:t xml:space="preserve">Selesai</w:t>
+            </w:r>
+          </w:p>
+        </w:tc>
+      </w:tr>
+      <w:tr>
+        <w:tc>
+          <w:p>
+            <w:pPr>
+              <w:pStyle w:val="Compact"/>
+              <w:jc w:val="left"/>
+            </w:pPr>
+            <w:r>
+              <w:t xml:space="preserve">E8.1</w:t>
+            </w:r>
+          </w:p>
+        </w:tc>
+        <w:tc>
+          <w:p>
+            <w:pPr>
+              <w:pStyle w:val="Compact"/>
+              <w:jc w:val="left"/>
+            </w:pPr>
+            <w:r>
+              <w:t xml:space="preserve">CRUD lemari penuh termasuk filter dan empty state</w:t>
+            </w:r>
+          </w:p>
+        </w:tc>
+        <w:tc>
+          <w:p>
+            <w:pPr>
+              <w:pStyle w:val="Compact"/>
+              <w:jc w:val="left"/>
+            </w:pPr>
+            <w:r>
+              <w:t xml:space="preserve">Izza</w:t>
+            </w:r>
+          </w:p>
+        </w:tc>
+        <w:tc>
+          <w:p>
+            <w:pPr>
+              <w:pStyle w:val="Compact"/>
+              <w:jc w:val="left"/>
+            </w:pPr>
+            <w:r>
+              <w:t xml:space="preserve">Selesai</w:t>
+            </w:r>
+          </w:p>
+        </w:tc>
+      </w:tr>
+      <w:tr>
+        <w:tc>
+          <w:p>
+            <w:pPr>
+              <w:pStyle w:val="Compact"/>
+              <w:jc w:val="left"/>
+            </w:pPr>
+            <w:r>
+              <w:t xml:space="preserve">E8.7</w:t>
+            </w:r>
+          </w:p>
+        </w:tc>
+        <w:tc>
+          <w:p>
+            <w:pPr>
+              <w:pStyle w:val="Compact"/>
+              <w:jc w:val="left"/>
+            </w:pPr>
+            <w:r>
+              <w:t xml:space="preserve">Halaman Profil menampilkan data pengguna dan sign out</w:t>
             </w:r>
           </w:p>
         </w:tc>
@@ -2184,152 +2124,106 @@
             </w:r>
           </w:p>
         </w:tc>
-      </w:tr>
-      <w:tr>
-        <w:tc>
-          <w:p>
-            <w:pPr>
-              <w:pStyle w:val="Compact"/>
-              <w:jc w:val="left"/>
-            </w:pPr>
-            <w:r>
-              <w:t xml:space="preserve">E8.6</w:t>
-            </w:r>
-          </w:p>
-        </w:tc>
-        <w:tc>
-          <w:p>
-            <w:pPr>
-              <w:pStyle w:val="Compact"/>
-              <w:jc w:val="left"/>
-            </w:pPr>
-            <w:r>
-              <w:t xml:space="preserve">Master data kategori dan jenis dapat dikelola dari aplikasi</w:t>
-            </w:r>
-          </w:p>
-        </w:tc>
-        <w:tc>
-          <w:p>
-            <w:pPr>
-              <w:pStyle w:val="Compact"/>
-              <w:jc w:val="left"/>
-            </w:pPr>
-            <w:r>
-              <w:t xml:space="preserve">Izza</w:t>
-            </w:r>
-          </w:p>
-        </w:tc>
-      </w:tr>
-      <w:tr>
-        <w:tc>
-          <w:p>
-            <w:pPr>
-              <w:pStyle w:val="Compact"/>
-              <w:jc w:val="left"/>
-            </w:pPr>
-            <w:r>
-              <w:t xml:space="preserve">E9.1</w:t>
-            </w:r>
-          </w:p>
-        </w:tc>
-        <w:tc>
-          <w:p>
-            <w:pPr>
-              <w:pStyle w:val="Compact"/>
-              <w:jc w:val="left"/>
-            </w:pPr>
-            <w:r>
-              <w:t xml:space="preserve">Dokumen rencana uji berisi minimal 20 test case, termasuk kasus negatif</w:t>
-            </w:r>
-          </w:p>
-        </w:tc>
-        <w:tc>
-          <w:p>
-            <w:pPr>
-              <w:pStyle w:val="Compact"/>
-              <w:jc w:val="left"/>
-            </w:pPr>
-            <w:r>
-              <w:t xml:space="preserve">Ahmad</w:t>
-            </w:r>
-          </w:p>
-        </w:tc>
-      </w:tr>
-      <w:tr>
-        <w:tc>
-          <w:p>
-            <w:pPr>
-              <w:pStyle w:val="Compact"/>
-              <w:jc w:val="left"/>
-            </w:pPr>
-            <w:r>
-              <w:t xml:space="preserve">E4.1–E4.2</w:t>
-            </w:r>
-          </w:p>
-        </w:tc>
-        <w:tc>
-          <w:p>
-            <w:pPr>
-              <w:pStyle w:val="Compact"/>
-              <w:jc w:val="left"/>
-            </w:pPr>
-            <w:r>
-              <w:t xml:space="preserve">Dataset bersih, laporan EDA singkat, split 70/15/15 tersimpan</w:t>
-            </w:r>
-          </w:p>
-        </w:tc>
-        <w:tc>
-          <w:p>
-            <w:pPr>
-              <w:pStyle w:val="Compact"/>
-              <w:jc w:val="left"/>
-            </w:pPr>
-            <w:r>
-              <w:t xml:space="preserve">Ahmad</w:t>
-            </w:r>
-          </w:p>
-        </w:tc>
-      </w:tr>
-      <w:tr>
-        <w:tc>
-          <w:p>
-            <w:pPr>
-              <w:pStyle w:val="Compact"/>
-              <w:jc w:val="left"/>
-            </w:pPr>
-            <w:r>
-              <w:t xml:space="preserve">PR #3</w:t>
-            </w:r>
-          </w:p>
-        </w:tc>
-        <w:tc>
-          <w:p>
-            <w:pPr>
-              <w:pStyle w:val="Compact"/>
-              <w:jc w:val="left"/>
-            </w:pPr>
-            <w:r>
-              <w:t xml:space="preserve">Digabung ke</w:t>
-            </w:r>
-            <w:r>
-              <w:t xml:space="preserve"> </w:t>
-            </w:r>
-            <w:r>
-              <w:rPr>
-                <w:rStyle w:val="VerbatimChar"/>
-              </w:rPr>
-              <w:t xml:space="preserve">main</w:t>
-            </w:r>
-          </w:p>
-        </w:tc>
-        <w:tc>
-          <w:p>
-            <w:pPr>
-              <w:pStyle w:val="Compact"/>
-              <w:jc w:val="left"/>
-            </w:pPr>
-            <w:r>
-              <w:t xml:space="preserve">Ahmad, Bisma</w:t>
+        <w:tc>
+          <w:p>
+            <w:pPr>
+              <w:pStyle w:val="Compact"/>
+              <w:jc w:val="left"/>
+            </w:pPr>
+            <w:r>
+              <w:t xml:space="preserve">Selesai</w:t>
+            </w:r>
+          </w:p>
+        </w:tc>
+      </w:tr>
+      <w:tr>
+        <w:tc>
+          <w:p>
+            <w:pPr>
+              <w:pStyle w:val="Compact"/>
+              <w:jc w:val="left"/>
+            </w:pPr>
+            <w:r>
+              <w:t xml:space="preserve">E8.2</w:t>
+            </w:r>
+          </w:p>
+        </w:tc>
+        <w:tc>
+          <w:p>
+            <w:pPr>
+              <w:pStyle w:val="Compact"/>
+              <w:jc w:val="left"/>
+            </w:pPr>
+            <w:r>
+              <w:t xml:space="preserve">Outfit tersimpan muncul di daftar</w:t>
+            </w:r>
+          </w:p>
+        </w:tc>
+        <w:tc>
+          <w:p>
+            <w:pPr>
+              <w:pStyle w:val="Compact"/>
+              <w:jc w:val="left"/>
+            </w:pPr>
+            <w:r>
+              <w:t xml:space="preserve">Abim</w:t>
+            </w:r>
+          </w:p>
+        </w:tc>
+        <w:tc>
+          <w:p>
+            <w:pPr>
+              <w:pStyle w:val="Compact"/>
+              <w:jc w:val="left"/>
+            </w:pPr>
+            <w:r>
+              <w:t xml:space="preserve">Berjalan</w:t>
+            </w:r>
+          </w:p>
+        </w:tc>
+      </w:tr>
+      <w:tr>
+        <w:tc>
+          <w:p>
+            <w:pPr>
+              <w:pStyle w:val="Compact"/>
+              <w:jc w:val="left"/>
+            </w:pPr>
+            <w:r>
+              <w:t xml:space="preserve">E8.4</w:t>
+            </w:r>
+          </w:p>
+        </w:tc>
+        <w:tc>
+          <w:p>
+            <w:pPr>
+              <w:pStyle w:val="Compact"/>
+              <w:jc w:val="left"/>
+            </w:pPr>
+            <w:r>
+              <w:t xml:space="preserve">Home memakai data lemari nyata</w:t>
+            </w:r>
+          </w:p>
+        </w:tc>
+        <w:tc>
+          <w:p>
+            <w:pPr>
+              <w:pStyle w:val="Compact"/>
+              <w:jc w:val="left"/>
+            </w:pPr>
+            <w:r>
+              <w:t xml:space="preserve">Abim</w:t>
+            </w:r>
+          </w:p>
+        </w:tc>
+        <w:tc>
+          <w:p>
+            <w:pPr>
+              <w:pStyle w:val="Compact"/>
+              <w:jc w:val="left"/>
+            </w:pPr>
+            <w:r>
+              <w:t xml:space="preserve">Berjalan</w:t>
             </w:r>
           </w:p>
         </w:tc>
@@ -2381,13 +2275,13 @@
       </w:r>
     </w:p>
     <w:bookmarkEnd w:id="28"/>
-    <w:bookmarkStart w:id="29" w:name="Xb5ae8d6b36c898d9676331d303a2233162acf3a"/>
+    <w:bookmarkStart w:id="29" w:name="X071820f58508c9820e9359fe1e2d87699f23a0f"/>
     <w:p>
       <w:pPr>
         <w:pStyle w:val="Heading2"/>
       </w:pPr>
       <w:r>
-        <w:t xml:space="preserve">4. Penghambat dan aksi</w:t>
+        <w:t xml:space="preserve">4. Tugas yang tidak dikerjakan minggu ini</w:t>
       </w:r>
     </w:p>
     <w:tbl>
@@ -2405,6 +2299,199 @@
               <w:jc w:val="left"/>
             </w:pPr>
             <w:r>
+              <w:t xml:space="preserve">Tugas</w:t>
+            </w:r>
+          </w:p>
+        </w:tc>
+        <w:tc>
+          <w:p>
+            <w:pPr>
+              <w:pStyle w:val="Compact"/>
+              <w:jc w:val="left"/>
+            </w:pPr>
+            <w:r>
+              <w:t xml:space="preserve">Alasan</w:t>
+            </w:r>
+          </w:p>
+        </w:tc>
+      </w:tr>
+      <w:tr>
+        <w:tc>
+          <w:p>
+            <w:pPr>
+              <w:pStyle w:val="Compact"/>
+              <w:jc w:val="left"/>
+            </w:pPr>
+            <w:r>
+              <w:t xml:space="preserve">E4 Model 1</w:t>
+            </w:r>
+          </w:p>
+        </w:tc>
+        <w:tc>
+          <w:p>
+            <w:pPr>
+              <w:pStyle w:val="Compact"/>
+              <w:jc w:val="left"/>
+            </w:pPr>
+            <w:r>
+              <w:t xml:space="preserve">ML, ditunda</w:t>
+            </w:r>
+          </w:p>
+        </w:tc>
+      </w:tr>
+      <w:tr>
+        <w:tc>
+          <w:p>
+            <w:pPr>
+              <w:pStyle w:val="Compact"/>
+              <w:jc w:val="left"/>
+            </w:pPr>
+            <w:r>
+              <w:t xml:space="preserve">E5 modul warna</w:t>
+            </w:r>
+          </w:p>
+        </w:tc>
+        <w:tc>
+          <w:p>
+            <w:pPr>
+              <w:pStyle w:val="Compact"/>
+              <w:jc w:val="left"/>
+            </w:pPr>
+            <w:r>
+              <w:t xml:space="preserve">Pemrosesan gambar, ditunda</w:t>
+            </w:r>
+          </w:p>
+        </w:tc>
+      </w:tr>
+      <w:tr>
+        <w:tc>
+          <w:p>
+            <w:pPr>
+              <w:pStyle w:val="Compact"/>
+              <w:jc w:val="left"/>
+            </w:pPr>
+            <w:r>
+              <w:t xml:space="preserve">E6 Model 3</w:t>
+            </w:r>
+          </w:p>
+        </w:tc>
+        <w:tc>
+          <w:p>
+            <w:pPr>
+              <w:pStyle w:val="Compact"/>
+              <w:jc w:val="left"/>
+            </w:pPr>
+            <w:r>
+              <w:t xml:space="preserve">ML, ditunda</w:t>
+            </w:r>
+          </w:p>
+        </w:tc>
+      </w:tr>
+      <w:tr>
+        <w:tc>
+          <w:p>
+            <w:pPr>
+              <w:pStyle w:val="Compact"/>
+              <w:jc w:val="left"/>
+            </w:pPr>
+            <w:r>
+              <w:t xml:space="preserve">E7 integrasi TFLite</w:t>
+            </w:r>
+          </w:p>
+        </w:tc>
+        <w:tc>
+          <w:p>
+            <w:pPr>
+              <w:pStyle w:val="Compact"/>
+              <w:jc w:val="left"/>
+            </w:pPr>
+            <w:r>
+              <w:t xml:space="preserve">Menunggu artefak model</w:t>
+            </w:r>
+          </w:p>
+        </w:tc>
+      </w:tr>
+      <w:tr>
+        <w:tc>
+          <w:p>
+            <w:pPr>
+              <w:pStyle w:val="Compact"/>
+              <w:jc w:val="left"/>
+            </w:pPr>
+            <w:r>
+              <w:t xml:space="preserve">E8.3, E8.5</w:t>
+            </w:r>
+          </w:p>
+        </w:tc>
+        <w:tc>
+          <w:p>
+            <w:pPr>
+              <w:pStyle w:val="Compact"/>
+              <w:jc w:val="left"/>
+            </w:pPr>
+            <w:r>
+              <w:t xml:space="preserve">Menunggu E7.4</w:t>
+            </w:r>
+          </w:p>
+        </w:tc>
+      </w:tr>
+      <w:tr>
+        <w:tc>
+          <w:p>
+            <w:pPr>
+              <w:pStyle w:val="Compact"/>
+              <w:jc w:val="left"/>
+            </w:pPr>
+            <w:r>
+              <w:t xml:space="preserve">E9 QA, E10 dokumentasi</w:t>
+            </w:r>
+          </w:p>
+        </w:tc>
+        <w:tc>
+          <w:p>
+            <w:pPr>
+              <w:pStyle w:val="Compact"/>
+              <w:jc w:val="left"/>
+            </w:pPr>
+            <w:r>
+              <w:t xml:space="preserve">Ditunda agar fokus mobile</w:t>
+            </w:r>
+          </w:p>
+        </w:tc>
+      </w:tr>
+    </w:tbl>
+    <w:p>
+      <w:r>
+        <w:pict>
+          <v:rect style="width:0;height:1.5pt" o:hralign="center" o:hrstd="t" o:hr="t"/>
+        </w:pict>
+      </w:r>
+    </w:p>
+    <w:bookmarkEnd w:id="29"/>
+    <w:bookmarkStart w:id="30" w:name="Xe033b7e7c5c57c625e923f38f5a5b1dc8e22a8a"/>
+    <w:p>
+      <w:pPr>
+        <w:pStyle w:val="Heading2"/>
+      </w:pPr>
+      <w:r>
+        <w:t xml:space="preserve">5. Penghambat dan aksi</w:t>
+      </w:r>
+    </w:p>
+    <w:tbl>
+      <w:tblPr>
+        <w:tblStyle w:val="Table"/>
+        <w:tblW w:type="pct" w:w="0.0"/>
+        <w:tblLook w:firstRow="1" w:lastRow="0" w:firstColumn="0" w:lastColumn="0" w:noHBand="0" w:noVBand="0" w:val="0020"/>
+      </w:tblPr>
+      <w:tblGrid/>
+      <w:tr>
+        <w:tc>
+          <w:p>
+            <w:pPr>
+              <w:pStyle w:val="Compact"/>
+              <w:jc w:val="left"/>
+            </w:pPr>
+            <w:r>
               <w:t xml:space="preserve">Penghambat</w:t>
             </w:r>
           </w:p>
@@ -2451,29 +2538,29 @@
               <w:jc w:val="left"/>
             </w:pPr>
             <w:r>
-              <w:t xml:space="preserve">PR #3 belum direview</w:t>
-            </w:r>
-          </w:p>
-        </w:tc>
-        <w:tc>
-          <w:p>
-            <w:pPr>
-              <w:pStyle w:val="Compact"/>
-              <w:jc w:val="left"/>
-            </w:pPr>
-            <w:r>
-              <w:t xml:space="preserve">Review lalu gabung</w:t>
-            </w:r>
-          </w:p>
-        </w:tc>
-        <w:tc>
-          <w:p>
-            <w:pPr>
-              <w:pStyle w:val="Compact"/>
-              <w:jc w:val="left"/>
-            </w:pPr>
-            <w:r>
-              <w:t xml:space="preserve">Ahmad, Bisma</w:t>
+              <w:t xml:space="preserve">Firebase belum ada</w:t>
+            </w:r>
+          </w:p>
+        </w:tc>
+        <w:tc>
+          <w:p>
+            <w:pPr>
+              <w:pStyle w:val="Compact"/>
+              <w:jc w:val="left"/>
+            </w:pPr>
+            <w:r>
+              <w:t xml:space="preserve">Buat proyek dan berkas konfigurasi lokal</w:t>
+            </w:r>
+          </w:p>
+        </w:tc>
+        <w:tc>
+          <w:p>
+            <w:pPr>
+              <w:pStyle w:val="Compact"/>
+              <w:jc w:val="left"/>
+            </w:pPr>
+            <w:r>
+              <w:t xml:space="preserve">Bisma</w:t>
             </w:r>
           </w:p>
         </w:tc>
@@ -2485,107 +2572,6 @@
             </w:pPr>
             <w:r>
               <w:t xml:space="preserve">28 Okt</w:t>
-            </w:r>
-          </w:p>
-        </w:tc>
-      </w:tr>
-      <w:tr>
-        <w:tc>
-          <w:p>
-            <w:pPr>
-              <w:pStyle w:val="Compact"/>
-              <w:jc w:val="left"/>
-            </w:pPr>
-            <w:r>
-              <w:t xml:space="preserve">Firebase belum ada</w:t>
-            </w:r>
-          </w:p>
-        </w:tc>
-        <w:tc>
-          <w:p>
-            <w:pPr>
-              <w:pStyle w:val="Compact"/>
-              <w:jc w:val="left"/>
-            </w:pPr>
-            <w:r>
-              <w:t xml:space="preserve">Buat proyek dan berkas konfigurasi lokal</w:t>
-            </w:r>
-          </w:p>
-        </w:tc>
-        <w:tc>
-          <w:p>
-            <w:pPr>
-              <w:pStyle w:val="Compact"/>
-              <w:jc w:val="left"/>
-            </w:pPr>
-            <w:r>
-              <w:t xml:space="preserve">Bisma</w:t>
-            </w:r>
-          </w:p>
-        </w:tc>
-        <w:tc>
-          <w:p>
-            <w:pPr>
-              <w:pStyle w:val="Compact"/>
-              <w:jc w:val="left"/>
-            </w:pPr>
-            <w:r>
-              <w:t xml:space="preserve">28 Okt</w:t>
-            </w:r>
-          </w:p>
-        </w:tc>
-      </w:tr>
-      <w:tr>
-        <w:tc>
-          <w:p>
-            <w:pPr>
-              <w:pStyle w:val="Compact"/>
-              <w:jc w:val="left"/>
-            </w:pPr>
-            <w:r>
-              <w:t xml:space="preserve">Dataset belum diunduh</w:t>
-            </w:r>
-          </w:p>
-        </w:tc>
-        <w:tc>
-          <w:p>
-            <w:pPr>
-              <w:pStyle w:val="Compact"/>
-              <w:jc w:val="left"/>
-            </w:pPr>
-            <w:r>
-              <w:t xml:space="preserve">Unduh 3 zip dan taruh di</w:t>
-            </w:r>
-            <w:r>
-              <w:t xml:space="preserve"> </w:t>
-            </w:r>
-            <w:r>
-              <w:rPr>
-                <w:rStyle w:val="VerbatimChar"/>
-              </w:rPr>
-              <w:t xml:space="preserve">ml/data/raw/</w:t>
-            </w:r>
-          </w:p>
-        </w:tc>
-        <w:tc>
-          <w:p>
-            <w:pPr>
-              <w:pStyle w:val="Compact"/>
-              <w:jc w:val="left"/>
-            </w:pPr>
-            <w:r>
-              <w:t xml:space="preserve">Ahmad</w:t>
-            </w:r>
-          </w:p>
-        </w:tc>
-        <w:tc>
-          <w:p>
-            <w:pPr>
-              <w:pStyle w:val="Compact"/>
-              <w:jc w:val="left"/>
-            </w:pPr>
-            <w:r>
-              <w:t xml:space="preserve">29 Okt</w:t>
             </w:r>
           </w:p>
         </w:tc>
@@ -2635,12 +2621,6 @@
               </w:rPr>
               <w:t xml:space="preserve">main</w:t>
             </w:r>
-            <w:r>
-              <w:t xml:space="preserve"> </w:t>
-            </w:r>
-            <w:r>
-              <w:t xml:space="preserve">sebelum E2.1</w:t>
-            </w:r>
           </w:p>
         </w:tc>
         <w:tc>
@@ -2651,6 +2631,52 @@
             </w:pPr>
             <w:r>
               <w:t xml:space="preserve">Pras</w:t>
+            </w:r>
+          </w:p>
+        </w:tc>
+        <w:tc>
+          <w:p>
+            <w:pPr>
+              <w:pStyle w:val="Compact"/>
+              <w:jc w:val="left"/>
+            </w:pPr>
+            <w:r>
+              <w:t xml:space="preserve">27 Okt</w:t>
+            </w:r>
+          </w:p>
+        </w:tc>
+      </w:tr>
+      <w:tr>
+        <w:tc>
+          <w:p>
+            <w:pPr>
+              <w:pStyle w:val="Compact"/>
+              <w:jc w:val="left"/>
+            </w:pPr>
+            <w:r>
+              <w:t xml:space="preserve">Tampilan Home dan Profil menunggu data</w:t>
+            </w:r>
+          </w:p>
+        </w:tc>
+        <w:tc>
+          <w:p>
+            <w:pPr>
+              <w:pStyle w:val="Compact"/>
+              <w:jc w:val="left"/>
+            </w:pPr>
+            <w:r>
+              <w:t xml:space="preserve">Bangun UI shell lebih dulu, sambungkan setelah prasyarat selesai</w:t>
+            </w:r>
+          </w:p>
+        </w:tc>
+        <w:tc>
+          <w:p>
+            <w:pPr>
+              <w:pStyle w:val="Compact"/>
+              <w:jc w:val="left"/>
+            </w:pPr>
+            <w:r>
+              <w:t xml:space="preserve">Abim</w:t>
             </w:r>
           </w:p>
         </w:tc>
@@ -2762,14 +2788,14 @@
         </w:pict>
       </w:r>
     </w:p>
-    <w:bookmarkEnd w:id="29"/>
-    <w:bookmarkStart w:id="30" w:name="Xc35a2a88856d88a23ea0b3b80e2f244596f1a13"/>
+    <w:bookmarkEnd w:id="30"/>
+    <w:bookmarkStart w:id="31" w:name="Xbdd6e82542b6a60073ffdf311101c4912cdc03a"/>
     <w:p>
       <w:pPr>
         <w:pStyle w:val="Heading2"/>
       </w:pPr>
       <w:r>
-        <w:t xml:space="preserve">5. Aturan</w:t>
+        <w:t xml:space="preserve">6. Aturan</w:t>
       </w:r>
     </w:p>
     <w:p>
@@ -2850,11 +2876,29 @@
         <w:pStyle w:val="Compact"/>
       </w:pPr>
       <w:r>
+        <w:t xml:space="preserve">Anggota yang selesai lebih cepat boleh mengambil tugas mobile lain yang belum</w:t>
+      </w:r>
+      <w:r>
+        <w:t xml:space="preserve"> </w:t>
+      </w:r>
+      <w:r>
+        <w:t xml:space="preserve">selesai, tetap maksimal 2 tugas aktif.</w:t>
+      </w:r>
+    </w:p>
+    <w:p>
+      <w:pPr>
+        <w:numPr>
+          <w:ilvl w:val="0"/>
+          <w:numId w:val="1001"/>
+        </w:numPr>
+        <w:pStyle w:val="Compact"/>
+      </w:pPr>
+      <w:r>
         <w:t xml:space="preserve">Status di papan Notion diperbarui setiap hari; rekap diisi Minggu, 1 November.</w:t>
       </w:r>
     </w:p>
-    <w:bookmarkEnd w:id="30"/>
     <w:bookmarkEnd w:id="31"/>
+    <w:bookmarkEnd w:id="32"/>
     <w:sectPr/>
   </w:body>
 </w:document>

</xml_diff>